<commit_message>
BI Mini Project Reports
</commit_message>
<xml_diff>
--- a/LP-V/DL/B_Group1_Mini_Project.docx
+++ b/LP-V/DL/B_Group1_Mini_Project.docx
@@ -1437,13 +1437,20 @@
         </w:rPr>
         <w:t xml:space="preserve"> </w:t>
       </w:r>
-      <w:proofErr w:type="spellStart"/>
       <w:r>
         <w:rPr>
           <w:b/>
           <w:sz w:val="28"/>
         </w:rPr>
-        <w:t>Reesma</w:t>
+        <w:t xml:space="preserve">Reshma </w:t>
+      </w:r>
+      <w:proofErr w:type="spellStart"/>
+      <w:r>
+        <w:rPr>
+          <w:b/>
+          <w:sz w:val="28"/>
+        </w:rPr>
+        <w:t>Yawalkar</w:t>
       </w:r>
       <w:proofErr w:type="spellEnd"/>
       <w:r>
@@ -1650,15 +1657,13 @@
         </w:rPr>
         <w:t xml:space="preserve">Prof. </w:t>
       </w:r>
-      <w:proofErr w:type="spellStart"/>
       <w:r>
         <w:rPr>
           <w:b/>
           <w:sz w:val="28"/>
         </w:rPr>
-        <w:t>Reesma</w:t>
-      </w:r>
-      <w:proofErr w:type="spellEnd"/>
+        <w:t>Reshma Yawalkar</w:t>
+      </w:r>
       <w:r>
         <w:rPr>
           <w:b/>
@@ -26031,6 +26036,7 @@
   <w:style w:type="character" w:default="1" w:styleId="DefaultParagraphFont">
     <w:name w:val="Default Paragraph Font"/>
     <w:uiPriority w:val="1"/>
+    <w:semiHidden/>
     <w:unhideWhenUsed/>
   </w:style>
   <w:style w:type="table" w:default="1" w:styleId="TableNormal">

</xml_diff>